<commit_message>
Plain-punctuation copy pass; align case-study cards
- Executive page and all blog posts rewritten without em/en dashes,
  semicolons or label colons (number ranges now read "30 to 60%")
- Post and blog page titles use "|"; link-preview short titles split on
  "|" or ":" and read "<Title> by Sandeep Midde"
- Case-study cards show the company only and use CSS subgrid so metrics,
  titles and Result blocks line up across each row
- Removed the leftover "delete this post" note from the welcome post

Co-Authored-By: Claude Opus 5.5 <noreply@anthropic.com>
</commit_message>
<xml_diff>
--- a/blog/agentic-ai-in-project-management/content.docx
+++ b/blog/agentic-ai-in-project-management/content.docx
@@ -17,7 +17,7 @@
     </w:p>
     <w:p>
       <w:r>
-        <w:t xml:space="preserve">The biggest project management story of 2026 isn't a new methodology — it's autonomy. Analysts now point to </w:t>
+        <w:t xml:space="preserve">The biggest project management story of 2026 isn't a new methodology. It's autonomy. Analysts now point to </w:t>
       </w:r>
       <w:r>
         <w:rPr>
@@ -27,12 +27,12 @@
         <w:t xml:space="preserve">agentic AI</w:t>
       </w:r>
       <w:r>
-        <w:t xml:space="preserve"> as the defining trend of the year: systems that don't just surface a dashboard, but autonomously identify resource bottlenecks, comb through project repositories, and trigger self-correction protocols the moment a project drifts from its baseline plan.</w:t>
-      </w:r>
-    </w:p>
-    <w:p>
-      <w:r>
-        <w:t xml:space="preserve">This matters because it changes what a PMO is for. The market backing this shift is real too — project management software is projected to grow from </w:t>
+        <w:t xml:space="preserve"> as the defining trend of the year, meaning systems that don't just surface a dashboard, but autonomously identify resource bottlenecks, comb through project repositories, and trigger self-correction protocols the moment a project drifts from its baseline plan.</w:t>
+      </w:r>
+    </w:p>
+    <w:p>
+      <w:r>
+        <w:t xml:space="preserve">This matters because it changes what a PMO is for. The market backing this shift is real too. Project management software is projected to grow from </w:t>
       </w:r>
       <w:r>
         <w:rPr>
@@ -42,7 +42,7 @@
         <w:t xml:space="preserve">$9.76 billion in 2025 to $11.27 billion in 2026</w:t>
       </w:r>
       <w:r>
-        <w:t xml:space="preserve">, a 15.42% compound annual growth rate — and leading PMOs are expected to move beyond status reporting to become the enablement layer connecting strategy to execution as these autonomous systems get deployed. For delivery leaders, the open question is less “should we adopt this” and more “who audits the agent when it decides to re-baseline a project on its own.”</w:t>
+        <w:t xml:space="preserve">, a 15.42% compound annual growth rate, and leading PMOs are expected to move beyond status reporting to become the enablement layer connecting strategy to execution as these autonomous systems get deployed. For delivery leaders, the open question is less “should we adopt this” and more “who audits the agent when it decides to re-baseline a project on its own.”</w:t>
       </w:r>
     </w:p>
     <w:p>

</xml_diff>

<commit_message>
Blog: topic filter alongside the formats, dual badges on cards
A quieter topic row (AI, Project Management, Technical, Governance) sits
under the format toggle and combines with it. Cards carry the format
stamp in its brand colour on the left and muted topic chips on the right.
Posts are retagged to the four topics, and the PMO post joins Surabhi's
Slate. The blog page gets a root <base>, so card images still load after
the toggle changes the address to /tales/ and friends.

Co-Authored-By: Claude Opus 5.5 <noreply@anthropic.com>
</commit_message>
<xml_diff>
--- a/blog/agentic-ai-in-project-management/content.docx
+++ b/blog/agentic-ai-in-project-management/content.docx
@@ -13,6 +13,11 @@
     <w:p>
       <w:r>
         <w:t xml:space="preserve">Tags: AI, Project Management</w:t>
+      </w:r>
+    </w:p>
+    <w:p>
+      <w:r>
+        <w:t xml:space="preserve">Series: Surabhi's Slate</w:t>
       </w:r>
     </w:p>
     <w:p>

</xml_diff>